<commit_message>
Finished use case document and UML use case diagram
</commit_message>
<xml_diff>
--- a/BankingProject_SRS_CS401.docx
+++ b/BankingProject_SRS_CS401.docx
@@ -31,8 +31,8 @@
           <w:sz w:val="28"/>
         </w:rPr>
         <w:sectPr>
-          <w:headerReference w:type="default" r:id="rId7"/>
-          <w:footerReference w:type="default" r:id="rId8"/>
+          <w:headerReference w:type="default" r:id="rId8"/>
+          <w:footerReference w:type="default" r:id="rId9"/>
           <w:pgSz w:w="12240" w:h="15840"/>
           <w:pgMar w:top="1440" w:right="1800" w:bottom="1800" w:left="1800" w:header="720" w:footer="1080" w:gutter="0"/>
           <w:pgNumType w:fmt="lowerRoman" w:start="1"/>
@@ -1153,7 +1153,28 @@
                 <w:color w:val="000000"/>
                 <w:u w:val="single"/>
               </w:rPr>
-              <w:t>2/27/2026</w:t>
+              <w:t>3</w:t>
+            </w:r>
+            <w:r>
+              <w:rPr>
+                <w:color w:val="000000"/>
+                <w:u w:val="single"/>
+              </w:rPr>
+              <w:t>/</w:t>
+            </w:r>
+            <w:r>
+              <w:rPr>
+                <w:color w:val="000000"/>
+                <w:u w:val="single"/>
+              </w:rPr>
+              <w:t>02</w:t>
+            </w:r>
+            <w:r>
+              <w:rPr>
+                <w:color w:val="000000"/>
+                <w:u w:val="single"/>
+              </w:rPr>
+              <w:t>/2026</w:t>
             </w:r>
           </w:p>
         </w:tc>
@@ -1205,7 +1226,7 @@
               <w:rPr>
                 <w:color w:val="000000"/>
               </w:rPr>
-              <w:t>Use Case Specification Document Progress</w:t>
+              <w:t>Completed Use Case Specification Document and UML Use Case Diagram</w:t>
             </w:r>
           </w:p>
         </w:tc>
@@ -1665,8 +1686,8 @@
           <w:u w:val="single"/>
         </w:rPr>
         <w:sectPr>
-          <w:headerReference w:type="default" r:id="rId9"/>
-          <w:footerReference w:type="default" r:id="rId10"/>
+          <w:headerReference w:type="default" r:id="rId10"/>
+          <w:footerReference w:type="default" r:id="rId11"/>
           <w:pgSz w:w="12240" w:h="15840"/>
           <w:pgMar w:top="1440" w:right="1800" w:bottom="1800" w:left="1800" w:header="720" w:footer="1080" w:gutter="0"/>
           <w:pgNumType w:fmt="lowerRoman"/>
@@ -1737,9 +1758,6 @@
             <w:instrText>TOC \o "1-3" \h</w:instrText>
           </w:r>
           <w:r>
-            <w:rPr>
-              <w:lang w:eastAsia="en-US"/>
-            </w:rPr>
             <w:fldChar w:fldCharType="separate"/>
           </w:r>
           <w:r>
@@ -3098,9 +3116,11 @@
       <w:r>
         <w:t xml:space="preserve"> major modules: the </w:t>
       </w:r>
+      <w:proofErr w:type="spellStart"/>
       <w:r>
         <w:t>tellerMode</w:t>
       </w:r>
+      <w:proofErr w:type="spellEnd"/>
       <w:r>
         <w:t xml:space="preserve"> module, the </w:t>
       </w:r>
@@ -3929,10 +3949,10 @@
     <w:p>
       <w:pPr>
         <w:sectPr>
-          <w:headerReference w:type="default" r:id="rId11"/>
-          <w:footerReference w:type="default" r:id="rId12"/>
-          <w:headerReference w:type="first" r:id="rId13"/>
-          <w:footerReference w:type="first" r:id="rId14"/>
+          <w:headerReference w:type="default" r:id="rId12"/>
+          <w:footerReference w:type="default" r:id="rId13"/>
+          <w:headerReference w:type="first" r:id="rId14"/>
+          <w:footerReference w:type="first" r:id="rId15"/>
           <w:pgSz w:w="12240" w:h="15840"/>
           <w:pgMar w:top="1440" w:right="1800" w:bottom="1800" w:left="1800" w:header="720" w:footer="1080" w:gutter="0"/>
           <w:pgNumType w:fmt="lowerRoman"/>
@@ -4189,6 +4209,15 @@
         </w:rPr>
         <w:t xml:space="preserve">Relevant Requirements: </w:t>
       </w:r>
+      <w:r>
+        <w:rPr>
+          <w:rFonts w:eastAsia="Noto Sans CJK SC"/>
+          <w:color w:val="000000"/>
+          <w:sz w:val="24"/>
+          <w:szCs w:val="24"/>
+        </w:rPr>
+        <w:t>3.1.2.1, 3.1.3.1</w:t>
+      </w:r>
     </w:p>
     <w:p>
       <w:pPr>
@@ -4878,6 +4907,15 @@
         </w:rPr>
         <w:t xml:space="preserve">Relevant Requirements: </w:t>
       </w:r>
+      <w:r>
+        <w:rPr>
+          <w:rFonts w:eastAsia="Noto Sans CJK SC"/>
+          <w:color w:val="000000"/>
+          <w:sz w:val="24"/>
+          <w:szCs w:val="24"/>
+        </w:rPr>
+        <w:t>3.1.2.5, 3.1.3.3</w:t>
+      </w:r>
     </w:p>
     <w:p>
       <w:pPr>
@@ -5059,25 +5097,7 @@
           <w:sz w:val="24"/>
           <w:szCs w:val="24"/>
         </w:rPr>
-        <w:t>The customer</w:t>
-      </w:r>
-      <w:r>
-        <w:rPr>
-          <w:rFonts w:eastAsia="Noto Sans CJK SC"/>
-          <w:color w:val="000000"/>
-          <w:sz w:val="24"/>
-          <w:szCs w:val="24"/>
-        </w:rPr>
-        <w:t>’</w:t>
-      </w:r>
-      <w:r>
-        <w:rPr>
-          <w:rFonts w:eastAsia="Noto Sans CJK SC"/>
-          <w:color w:val="000000"/>
-          <w:sz w:val="24"/>
-          <w:szCs w:val="24"/>
-        </w:rPr>
-        <w:t>s balance is updated.</w:t>
+        <w:t>The customer’s balance is updated.</w:t>
       </w:r>
     </w:p>
     <w:p>
@@ -5261,6 +5281,15 @@
         </w:rPr>
         <w:t xml:space="preserve">Exceptions: </w:t>
       </w:r>
+      <w:r>
+        <w:rPr>
+          <w:rFonts w:eastAsia="Noto Sans CJK SC"/>
+          <w:color w:val="000000"/>
+          <w:sz w:val="24"/>
+          <w:szCs w:val="24"/>
+        </w:rPr>
+        <w:t>Daily Limit Exceeded, Insufficient Funds.</w:t>
+      </w:r>
     </w:p>
     <w:p>
       <w:pPr>
@@ -5394,6 +5423,15 @@
           <w:szCs w:val="24"/>
         </w:rPr>
         <w:t xml:space="preserve">Relevant Requirements: </w:t>
+      </w:r>
+      <w:r>
+        <w:rPr>
+          <w:rFonts w:eastAsia="Noto Sans CJK SC"/>
+          <w:color w:val="000000"/>
+          <w:sz w:val="24"/>
+          <w:szCs w:val="24"/>
+        </w:rPr>
+        <w:t>3.1.2.5, 3.1.3.3</w:t>
       </w:r>
     </w:p>
     <w:p>
@@ -5702,6 +5740,15 @@
         </w:rPr>
         <w:t>Exceptions:</w:t>
       </w:r>
+      <w:r>
+        <w:rPr>
+          <w:rFonts w:eastAsia="Noto Sans CJK SC"/>
+          <w:color w:val="000000"/>
+          <w:sz w:val="24"/>
+          <w:szCs w:val="24"/>
+        </w:rPr>
+        <w:t xml:space="preserve"> Frozen Account, Deposit Amount Invalid.</w:t>
+      </w:r>
     </w:p>
     <w:p>
       <w:pPr>
@@ -5846,7 +5893,25 @@
           <w:sz w:val="24"/>
           <w:szCs w:val="24"/>
         </w:rPr>
-        <w:t>Use Case Name: Checking and Saving Transfers</w:t>
+        <w:t xml:space="preserve">Use Case Name: </w:t>
+      </w:r>
+      <w:r>
+        <w:rPr>
+          <w:rFonts w:eastAsia="Noto Sans CJK SC"/>
+          <w:color w:val="000000"/>
+          <w:sz w:val="24"/>
+          <w:szCs w:val="24"/>
+        </w:rPr>
+        <w:t>Internal</w:t>
+      </w:r>
+      <w:r>
+        <w:rPr>
+          <w:rFonts w:eastAsia="Noto Sans CJK SC"/>
+          <w:color w:val="000000"/>
+          <w:sz w:val="24"/>
+          <w:szCs w:val="24"/>
+        </w:rPr>
+        <w:t xml:space="preserve"> Transfers</w:t>
       </w:r>
     </w:p>
     <w:p>
@@ -5871,6 +5936,15 @@
           <w:szCs w:val="24"/>
         </w:rPr>
         <w:t xml:space="preserve">Relevant Requirements: </w:t>
+      </w:r>
+      <w:r>
+        <w:rPr>
+          <w:rFonts w:eastAsia="Noto Sans CJK SC"/>
+          <w:color w:val="000000"/>
+          <w:sz w:val="24"/>
+          <w:szCs w:val="24"/>
+        </w:rPr>
+        <w:t>3.1.3.5</w:t>
       </w:r>
     </w:p>
     <w:p>
@@ -6173,34 +6247,7 @@
           <w:sz w:val="24"/>
           <w:szCs w:val="24"/>
         </w:rPr>
-        <w:t xml:space="preserve">If the </w:t>
-      </w:r>
-      <w:r>
-        <w:rPr>
-          <w:rFonts w:eastAsia="Noto Sans CJK SC"/>
-          <w:color w:val="000000"/>
-          <w:sz w:val="24"/>
-          <w:szCs w:val="24"/>
-        </w:rPr>
-        <w:t>transfer</w:t>
-      </w:r>
-      <w:r>
-        <w:rPr>
-          <w:rFonts w:eastAsia="Noto Sans CJK SC"/>
-          <w:color w:val="000000"/>
-          <w:sz w:val="24"/>
-          <w:szCs w:val="24"/>
-        </w:rPr>
-        <w:t xml:space="preserve"> exceeds a daily limit then the system denies the request and displays an error</w:t>
-      </w:r>
-      <w:r>
-        <w:rPr>
-          <w:rFonts w:eastAsia="Noto Sans CJK SC"/>
-          <w:color w:val="000000"/>
-          <w:sz w:val="24"/>
-          <w:szCs w:val="24"/>
-        </w:rPr>
-        <w:t>.</w:t>
+        <w:t>If the transfer exceeds a daily limit then the system denies the request and displays an error.</w:t>
       </w:r>
     </w:p>
     <w:p>
@@ -6255,6 +6302,15 @@
         </w:rPr>
         <w:t xml:space="preserve">Exceptions: </w:t>
       </w:r>
+      <w:r>
+        <w:rPr>
+          <w:rFonts w:eastAsia="Noto Sans CJK SC"/>
+          <w:color w:val="000000"/>
+          <w:sz w:val="24"/>
+          <w:szCs w:val="24"/>
+        </w:rPr>
+        <w:t>Daily Limit Exceeded, Insufficient Funds, Frozen Account.</w:t>
+      </w:r>
     </w:p>
     <w:p>
       <w:pPr>
@@ -6424,6 +6480,15 @@
           <w:szCs w:val="24"/>
         </w:rPr>
         <w:t xml:space="preserve">Relevant Requirements: </w:t>
+      </w:r>
+      <w:r>
+        <w:rPr>
+          <w:rFonts w:eastAsia="Noto Sans CJK SC"/>
+          <w:color w:val="000000"/>
+          <w:sz w:val="24"/>
+          <w:szCs w:val="24"/>
+        </w:rPr>
+        <w:t>3.1.2.6</w:t>
       </w:r>
     </w:p>
     <w:p>
@@ -6752,6 +6817,15 @@
         </w:rPr>
         <w:t xml:space="preserve">Exceptions: </w:t>
       </w:r>
+      <w:r>
+        <w:rPr>
+          <w:rFonts w:eastAsia="Noto Sans CJK SC"/>
+          <w:color w:val="000000"/>
+          <w:sz w:val="24"/>
+          <w:szCs w:val="24"/>
+        </w:rPr>
+        <w:t>Frozen Account, Insufficient Funds, Recipient Not Found.</w:t>
+      </w:r>
     </w:p>
     <w:p>
       <w:pPr>
@@ -6906,6 +6980,15 @@
           <w:szCs w:val="24"/>
         </w:rPr>
         <w:t xml:space="preserve">Relevant Requirements: </w:t>
+      </w:r>
+      <w:r>
+        <w:rPr>
+          <w:rFonts w:eastAsia="Noto Sans CJK SC"/>
+          <w:color w:val="000000"/>
+          <w:sz w:val="24"/>
+          <w:szCs w:val="24"/>
+        </w:rPr>
+        <w:t>3.1.2.7, 3.1.2.12, 3.1.3.4</w:t>
       </w:r>
     </w:p>
     <w:p>
@@ -7159,7 +7242,45 @@
           <w:sz w:val="24"/>
           <w:szCs w:val="24"/>
         </w:rPr>
-        <w:t>If no transactions exist in the selected date range then the system displays “No transactions found”.</w:t>
+        <w:t xml:space="preserve">If no transactions exist in the selected date range then the system displays “No transactions </w:t>
+      </w:r>
+      <w:proofErr w:type="gramStart"/>
+      <w:r>
+        <w:rPr>
+          <w:rFonts w:eastAsia="Noto Sans CJK SC"/>
+          <w:color w:val="000000"/>
+          <w:sz w:val="24"/>
+          <w:szCs w:val="24"/>
+        </w:rPr>
+        <w:t>found</w:t>
+      </w:r>
+      <w:r>
+        <w:rPr>
+          <w:rFonts w:eastAsia="Noto Sans CJK SC"/>
+          <w:color w:val="000000"/>
+          <w:sz w:val="24"/>
+          <w:szCs w:val="24"/>
+        </w:rPr>
+        <w:t>s</w:t>
+      </w:r>
+      <w:proofErr w:type="gramEnd"/>
+      <w:r>
+        <w:rPr>
+          <w:rFonts w:eastAsia="Noto Sans CJK SC"/>
+          <w:color w:val="000000"/>
+          <w:sz w:val="24"/>
+          <w:szCs w:val="24"/>
+        </w:rPr>
+        <w:t>”</w:t>
+      </w:r>
+      <w:r>
+        <w:rPr>
+          <w:rFonts w:eastAsia="Noto Sans CJK SC"/>
+          <w:color w:val="000000"/>
+          <w:sz w:val="24"/>
+          <w:szCs w:val="24"/>
+        </w:rPr>
+        <w:t>.</w:t>
       </w:r>
     </w:p>
     <w:p>
@@ -7185,6 +7306,15 @@
         </w:rPr>
         <w:t xml:space="preserve">Exceptions: </w:t>
       </w:r>
+      <w:r>
+        <w:rPr>
+          <w:rFonts w:eastAsia="Noto Sans CJK SC"/>
+          <w:color w:val="000000"/>
+          <w:sz w:val="24"/>
+          <w:szCs w:val="24"/>
+        </w:rPr>
+        <w:t>No Transactions Found</w:t>
+      </w:r>
     </w:p>
     <w:p>
       <w:pPr>
@@ -7413,6 +7543,15 @@
           <w:szCs w:val="24"/>
         </w:rPr>
         <w:t xml:space="preserve">Relevant Requirements: </w:t>
+      </w:r>
+      <w:r>
+        <w:rPr>
+          <w:rFonts w:eastAsia="Noto Sans CJK SC"/>
+          <w:color w:val="000000"/>
+          <w:sz w:val="24"/>
+          <w:szCs w:val="24"/>
+        </w:rPr>
+        <w:t>3.1.2.8</w:t>
       </w:r>
     </w:p>
     <w:p>
@@ -7666,16 +7805,7 @@
           <w:sz w:val="24"/>
           <w:szCs w:val="24"/>
         </w:rPr>
-        <w:t>If the account is frozen due to fraud, the customer can’t unfreeze the account</w:t>
-      </w:r>
-      <w:r>
-        <w:rPr>
-          <w:rFonts w:eastAsia="Noto Sans CJK SC"/>
-          <w:color w:val="000000"/>
-          <w:sz w:val="24"/>
-          <w:szCs w:val="24"/>
-        </w:rPr>
-        <w:t xml:space="preserve"> and is instructed to contact customer service.</w:t>
+        <w:t>If the account is frozen due to fraud, the customer can’t unfreeze the account and is instructed to contact customer service.</w:t>
       </w:r>
     </w:p>
     <w:p>
@@ -7701,6 +7831,15 @@
         </w:rPr>
         <w:t xml:space="preserve">Exceptions: </w:t>
       </w:r>
+      <w:r>
+        <w:rPr>
+          <w:rFonts w:eastAsia="Noto Sans CJK SC"/>
+          <w:color w:val="000000"/>
+          <w:sz w:val="24"/>
+          <w:szCs w:val="24"/>
+        </w:rPr>
+        <w:t>Must Contact Customer Service, Frozen Account.</w:t>
+      </w:r>
     </w:p>
     <w:p>
       <w:pPr>
@@ -7865,6 +8004,15 @@
           <w:szCs w:val="24"/>
         </w:rPr>
         <w:t xml:space="preserve">Relevant Requirements: </w:t>
+      </w:r>
+      <w:r>
+        <w:rPr>
+          <w:rFonts w:eastAsia="Noto Sans CJK SC"/>
+          <w:color w:val="000000"/>
+          <w:sz w:val="24"/>
+          <w:szCs w:val="24"/>
+        </w:rPr>
+        <w:t>3.1.2.9</w:t>
       </w:r>
     </w:p>
     <w:p>
@@ -8198,6 +8346,15 @@
         </w:rPr>
         <w:t xml:space="preserve">Exceptions: </w:t>
       </w:r>
+      <w:r>
+        <w:rPr>
+          <w:rFonts w:eastAsia="Noto Sans CJK SC"/>
+          <w:color w:val="000000"/>
+          <w:sz w:val="24"/>
+          <w:szCs w:val="24"/>
+        </w:rPr>
+        <w:t>Maximum Account Type Limit Reached.</w:t>
+      </w:r>
     </w:p>
     <w:p>
       <w:pPr>
@@ -8303,58 +8460,31 @@
           <w:szCs w:val="24"/>
         </w:rPr>
         <w:lastRenderedPageBreak/>
-        <w:t>Use Case ID: UC</w:t>
-      </w:r>
-      <w:r>
-        <w:rPr>
-          <w:rFonts w:eastAsia="Noto Sans CJK SC"/>
-          <w:color w:val="000000"/>
-          <w:sz w:val="24"/>
-          <w:szCs w:val="24"/>
-        </w:rPr>
-        <w:t>9</w:t>
-      </w:r>
-    </w:p>
-    <w:p>
-      <w:pPr>
-        <w:suppressAutoHyphens w:val="0"/>
-        <w:autoSpaceDE w:val="0"/>
-        <w:autoSpaceDN w:val="0"/>
-        <w:adjustRightInd w:val="0"/>
-        <w:spacing w:line="480" w:lineRule="auto"/>
-        <w:rPr>
-          <w:rFonts w:eastAsia="Noto Sans CJK SC"/>
-          <w:color w:val="000000"/>
-          <w:sz w:val="24"/>
-          <w:szCs w:val="24"/>
-        </w:rPr>
-      </w:pPr>
-      <w:r>
-        <w:rPr>
-          <w:rFonts w:eastAsia="Noto Sans CJK SC"/>
-          <w:color w:val="000000"/>
-          <w:sz w:val="24"/>
-          <w:szCs w:val="24"/>
-        </w:rPr>
-        <w:t xml:space="preserve">Use Case Name: </w:t>
-      </w:r>
-      <w:r>
-        <w:rPr>
-          <w:rFonts w:eastAsia="Noto Sans CJK SC"/>
-          <w:color w:val="000000"/>
-          <w:sz w:val="24"/>
-          <w:szCs w:val="24"/>
-        </w:rPr>
-        <w:t>Close</w:t>
-      </w:r>
-      <w:r>
-        <w:rPr>
-          <w:rFonts w:eastAsia="Noto Sans CJK SC"/>
-          <w:color w:val="000000"/>
-          <w:sz w:val="24"/>
-          <w:szCs w:val="24"/>
-        </w:rPr>
-        <w:t xml:space="preserve"> Account</w:t>
+        <w:t>Use Case ID: UC9</w:t>
+      </w:r>
+    </w:p>
+    <w:p>
+      <w:pPr>
+        <w:suppressAutoHyphens w:val="0"/>
+        <w:autoSpaceDE w:val="0"/>
+        <w:autoSpaceDN w:val="0"/>
+        <w:adjustRightInd w:val="0"/>
+        <w:spacing w:line="480" w:lineRule="auto"/>
+        <w:rPr>
+          <w:rFonts w:eastAsia="Noto Sans CJK SC"/>
+          <w:color w:val="000000"/>
+          <w:sz w:val="24"/>
+          <w:szCs w:val="24"/>
+        </w:rPr>
+      </w:pPr>
+      <w:r>
+        <w:rPr>
+          <w:rFonts w:eastAsia="Noto Sans CJK SC"/>
+          <w:color w:val="000000"/>
+          <w:sz w:val="24"/>
+          <w:szCs w:val="24"/>
+        </w:rPr>
+        <w:t>Use Case Name: Close Account</w:t>
       </w:r>
     </w:p>
     <w:p>
@@ -8379,6 +8509,15 @@
           <w:szCs w:val="24"/>
         </w:rPr>
         <w:t xml:space="preserve">Relevant Requirements: </w:t>
+      </w:r>
+      <w:r>
+        <w:rPr>
+          <w:rFonts w:eastAsia="Noto Sans CJK SC"/>
+          <w:color w:val="000000"/>
+          <w:sz w:val="24"/>
+          <w:szCs w:val="24"/>
+        </w:rPr>
+        <w:t>3.1.2.9</w:t>
       </w:r>
     </w:p>
     <w:p>
@@ -8696,6 +8835,15 @@
         </w:rPr>
         <w:t xml:space="preserve">Exceptions: </w:t>
       </w:r>
+      <w:r>
+        <w:rPr>
+          <w:rFonts w:eastAsia="Noto Sans CJK SC"/>
+          <w:color w:val="000000"/>
+          <w:sz w:val="24"/>
+          <w:szCs w:val="24"/>
+        </w:rPr>
+        <w:t>Balance Not Zero, Pending Transactions.</w:t>
+      </w:r>
     </w:p>
     <w:p>
       <w:pPr>
@@ -8762,13 +8910,167 @@
     </w:p>
     <w:p>
       <w:pPr>
-        <w:rPr>
-          <w:rFonts w:eastAsia="Noto Sans CJK SC"/>
-          <w:color w:val="000000"/>
-          <w:sz w:val="24"/>
-          <w:szCs w:val="24"/>
-        </w:rPr>
-      </w:pPr>
+        <w:suppressAutoHyphens w:val="0"/>
+        <w:autoSpaceDE w:val="0"/>
+        <w:autoSpaceDN w:val="0"/>
+        <w:adjustRightInd w:val="0"/>
+        <w:spacing w:line="480" w:lineRule="auto"/>
+        <w:rPr>
+          <w:rFonts w:eastAsia="Noto Sans CJK SC"/>
+          <w:color w:val="000000"/>
+          <w:sz w:val="24"/>
+          <w:szCs w:val="24"/>
+        </w:rPr>
+      </w:pPr>
+    </w:p>
+    <w:p>
+      <w:pPr>
+        <w:suppressAutoHyphens w:val="0"/>
+        <w:autoSpaceDE w:val="0"/>
+        <w:autoSpaceDN w:val="0"/>
+        <w:adjustRightInd w:val="0"/>
+        <w:spacing w:line="480" w:lineRule="auto"/>
+        <w:rPr>
+          <w:rFonts w:eastAsia="Noto Sans CJK SC"/>
+          <w:color w:val="000000"/>
+          <w:sz w:val="24"/>
+          <w:szCs w:val="24"/>
+        </w:rPr>
+      </w:pPr>
+    </w:p>
+    <w:p>
+      <w:pPr>
+        <w:rPr>
+          <w:rFonts w:eastAsia="Noto Sans CJK SC"/>
+          <w:color w:val="000000"/>
+          <w:sz w:val="24"/>
+          <w:szCs w:val="24"/>
+        </w:rPr>
+      </w:pPr>
+      <w:r>
+        <w:rPr>
+          <w:rFonts w:eastAsia="Noto Sans CJK SC"/>
+          <w:color w:val="000000"/>
+          <w:sz w:val="24"/>
+          <w:szCs w:val="24"/>
+        </w:rPr>
+        <w:br w:type="page"/>
+      </w:r>
+    </w:p>
+    <w:p>
+      <w:pPr>
+        <w:suppressAutoHyphens w:val="0"/>
+        <w:autoSpaceDE w:val="0"/>
+        <w:autoSpaceDN w:val="0"/>
+        <w:adjustRightInd w:val="0"/>
+        <w:spacing w:line="480" w:lineRule="auto"/>
+        <w:rPr>
+          <w:rFonts w:eastAsia="Noto Sans CJK SC"/>
+          <w:color w:val="000000"/>
+          <w:sz w:val="24"/>
+          <w:szCs w:val="24"/>
+        </w:rPr>
+      </w:pPr>
+    </w:p>
+    <w:p>
+      <w:pPr>
+        <w:suppressAutoHyphens w:val="0"/>
+        <w:autoSpaceDE w:val="0"/>
+        <w:autoSpaceDN w:val="0"/>
+        <w:adjustRightInd w:val="0"/>
+        <w:spacing w:after="60"/>
+        <w:jc w:val="center"/>
+        <w:rPr>
+          <w:rFonts w:ascii="Arial" w:eastAsia="Noto Sans CJK SC" w:hAnsi="Arial" w:cs="Arial"/>
+          <w:color w:val="000000"/>
+          <w:sz w:val="36"/>
+          <w:szCs w:val="36"/>
+        </w:rPr>
+      </w:pPr>
+      <w:r>
+        <w:rPr>
+          <w:rFonts w:ascii="Arial" w:eastAsia="Noto Sans CJK SC" w:hAnsi="Arial" w:cs="Arial"/>
+          <w:color w:val="000000"/>
+          <w:sz w:val="36"/>
+          <w:szCs w:val="36"/>
+        </w:rPr>
+        <w:t>UML Use Case Diagram</w:t>
+      </w:r>
+    </w:p>
+    <w:p>
+      <w:pPr>
+        <w:suppressAutoHyphens w:val="0"/>
+        <w:autoSpaceDE w:val="0"/>
+        <w:autoSpaceDN w:val="0"/>
+        <w:adjustRightInd w:val="0"/>
+        <w:spacing w:line="480" w:lineRule="auto"/>
+        <w:rPr>
+          <w:rFonts w:eastAsia="Noto Sans CJK SC"/>
+          <w:color w:val="000000"/>
+          <w:sz w:val="24"/>
+          <w:szCs w:val="24"/>
+        </w:rPr>
+      </w:pPr>
+    </w:p>
+    <w:p>
+      <w:pPr>
+        <w:rPr>
+          <w:rFonts w:eastAsia="Noto Sans CJK SC"/>
+          <w:color w:val="000000"/>
+          <w:sz w:val="24"/>
+          <w:szCs w:val="24"/>
+        </w:rPr>
+      </w:pPr>
+      <w:r>
+        <w:rPr>
+          <w:rFonts w:eastAsia="Noto Sans CJK SC"/>
+          <w:noProof/>
+          <w:color w:val="000000"/>
+          <w:sz w:val="24"/>
+          <w:szCs w:val="24"/>
+        </w:rPr>
+        <w:drawing>
+          <wp:inline distT="0" distB="0" distL="0" distR="0" wp14:anchorId="34948986" wp14:editId="6241E22E">
+            <wp:extent cx="5486400" cy="6412865"/>
+            <wp:effectExtent l="0" t="0" r="0" b="0"/>
+            <wp:docPr id="293444551" name="Picture 3" descr="A diagram of a company&#10;&#10;AI-generated content may be incorrect."/>
+            <wp:cNvGraphicFramePr>
+              <a:graphicFrameLocks xmlns:a="http://schemas.openxmlformats.org/drawingml/2006/main" noChangeAspect="1"/>
+            </wp:cNvGraphicFramePr>
+            <a:graphic xmlns:a="http://schemas.openxmlformats.org/drawingml/2006/main">
+              <a:graphicData uri="http://schemas.openxmlformats.org/drawingml/2006/picture">
+                <pic:pic xmlns:pic="http://schemas.openxmlformats.org/drawingml/2006/picture">
+                  <pic:nvPicPr>
+                    <pic:cNvPr id="293444551" name="Picture 3" descr="A diagram of a company&#10;&#10;AI-generated content may be incorrect."/>
+                    <pic:cNvPicPr/>
+                  </pic:nvPicPr>
+                  <pic:blipFill>
+                    <a:blip r:embed="rId16" cstate="print">
+                      <a:extLst>
+                        <a:ext uri="{28A0092B-C50C-407E-A947-70E740481C1C}">
+                          <a14:useLocalDpi xmlns:a14="http://schemas.microsoft.com/office/drawing/2010/main" val="0"/>
+                        </a:ext>
+                      </a:extLst>
+                    </a:blip>
+                    <a:stretch>
+                      <a:fillRect/>
+                    </a:stretch>
+                  </pic:blipFill>
+                  <pic:spPr>
+                    <a:xfrm>
+                      <a:off x="0" y="0"/>
+                      <a:ext cx="5486400" cy="6412865"/>
+                    </a:xfrm>
+                    <a:prstGeom prst="rect">
+                      <a:avLst/>
+                    </a:prstGeom>
+                  </pic:spPr>
+                </pic:pic>
+              </a:graphicData>
+            </a:graphic>
+          </wp:inline>
+        </w:drawing>
+      </w:r>
     </w:p>
     <w:sectPr>
       <w:type w:val="continuous"/>
@@ -8898,17 +9200,8 @@
                               <w:rStyle w:val="PageNumber"/>
                               <w:color w:val="000000"/>
                             </w:rPr>
-                            <w:t>i</w:t>
+                            <w:t>ii</w:t>
                           </w:r>
-                          <w:proofErr w:type="spellStart"/>
-                          <w:r>
-                            <w:rPr>
-                              <w:rStyle w:val="PageNumber"/>
-                              <w:color w:val="000000"/>
-                            </w:rPr>
-                            <w:t>i</w:t>
-                          </w:r>
-                          <w:proofErr w:type="spellEnd"/>
                           <w:r>
                             <w:rPr>
                               <w:rStyle w:val="PageNumber"/>
@@ -8963,17 +9256,8 @@
                         <w:rStyle w:val="PageNumber"/>
                         <w:color w:val="000000"/>
                       </w:rPr>
-                      <w:t>i</w:t>
+                      <w:t>ii</w:t>
                     </w:r>
-                    <w:proofErr w:type="spellStart"/>
-                    <w:r>
-                      <w:rPr>
-                        <w:rStyle w:val="PageNumber"/>
-                        <w:color w:val="000000"/>
-                      </w:rPr>
-                      <w:t>i</w:t>
-                    </w:r>
-                    <w:proofErr w:type="spellEnd"/>
                     <w:r>
                       <w:rPr>
                         <w:rStyle w:val="PageNumber"/>
@@ -9081,17 +9365,8 @@
                               <w:rStyle w:val="PageNumber"/>
                               <w:color w:val="000000"/>
                             </w:rPr>
-                            <w:t>vii</w:t>
+                            <w:t>viii</w:t>
                           </w:r>
-                          <w:proofErr w:type="spellStart"/>
-                          <w:r>
-                            <w:rPr>
-                              <w:rStyle w:val="PageNumber"/>
-                              <w:color w:val="000000"/>
-                            </w:rPr>
-                            <w:t>i</w:t>
-                          </w:r>
-                          <w:proofErr w:type="spellEnd"/>
                           <w:r>
                             <w:rPr>
                               <w:rStyle w:val="PageNumber"/>
@@ -9146,17 +9421,8 @@
                         <w:rStyle w:val="PageNumber"/>
                         <w:color w:val="000000"/>
                       </w:rPr>
-                      <w:t>vii</w:t>
+                      <w:t>viii</w:t>
                     </w:r>
-                    <w:proofErr w:type="spellStart"/>
-                    <w:r>
-                      <w:rPr>
-                        <w:rStyle w:val="PageNumber"/>
-                        <w:color w:val="000000"/>
-                      </w:rPr>
-                      <w:t>i</w:t>
-                    </w:r>
-                    <w:proofErr w:type="spellEnd"/>
                     <w:r>
                       <w:rPr>
                         <w:rStyle w:val="PageNumber"/>
@@ -13166,6 +13432,7 @@
   <w:style w:type="paragraph" w:default="1" w:styleId="Normal">
     <w:name w:val="Normal"/>
     <w:qFormat/>
+    <w:rsid w:val="00C8609B"/>
     <w:rPr>
       <w:rFonts w:ascii="Times New Roman" w:eastAsia="Times New Roman" w:hAnsi="Times New Roman" w:cs="Times New Roman"/>
       <w:sz w:val="20"/>
@@ -13437,7 +13704,6 @@
     <w:rPr>
       <w:color w:val="000080"/>
       <w:u w:val="single"/>
-      <w:lang/>
     </w:rPr>
   </w:style>
   <w:style w:type="character" w:customStyle="1" w:styleId="IndexLink">
@@ -14126,4 +14392,16 @@
     </a:ext>
   </a:extLst>
 </a:theme>
+</file>
+
+<file path=customXml/item1.xml><?xml version="1.0" encoding="utf-8"?>
+<b:Sources xmlns:b="http://schemas.openxmlformats.org/officeDocument/2006/bibliography" xmlns="http://schemas.openxmlformats.org/officeDocument/2006/bibliography" SelectedStyle="/APASixthEditionOfficeOnline.xsl" StyleName="APA" Version="6"/>
+</file>
+
+<file path=customXml/itemProps1.xml><?xml version="1.0" encoding="utf-8"?>
+<ds:datastoreItem xmlns:ds="http://schemas.openxmlformats.org/officeDocument/2006/customXml" ds:itemID="{31B411CA-99F7-314D-8727-A7D90967D19C}">
+  <ds:schemaRefs>
+    <ds:schemaRef ds:uri="http://schemas.openxmlformats.org/officeDocument/2006/bibliography"/>
+  </ds:schemaRefs>
+</ds:datastoreItem>
 </file>
</xml_diff>